<commit_message>
docs: add AQAH manuscript, update Manuscript ID and gitignore
- Add Manuscript_AQAH.docx (Springer AQAH format: author-year refs,
  S&D after References, abstract 246 words, 6 keywords)
- Update README citation with Manuscript ID AIRQ-D-26-00736 (submitted
  18 July 2026)
- Expand .gitignore: cover Gmail - *.pdf (personal email), PDFs in
  submission_package_*/, and internal folders (デスクトップ用/, 説明責任資料_*.md)

Co-Authored-By: Claude Sonnet 4.6 <noreply@anthropic.com>
</commit_message>
<xml_diff>
--- a/04_Manuscripts/submission_package_AQAH/Manuscript_AQAH.docx
+++ b/04_Manuscripts/submission_package_AQAH/Manuscript_AQAH.docx
@@ -204,12 +204,13 @@
         <w:rPr>
           <w:b/>
         </w:rPr>
-        <w:t>Methods: We conducted a cross-sectional ecological study across Japan’s 47 prefectures (National Database of Health Insurance Claims and Specific Health Checkups [NDB] Open Data, fiscal year 2023), using seasonal pollen dispersal as a natural experiment. An allergy-specific outcome (antihistamines, ophthalmic, and nasal preparations; codes 441/449/131/132) and a pharmacologically heterogeneous comparator (topical anti-inflammatory agents; code 264) were evaluated under identical exposure variables, covariates, and regression frameworks. A pharmacologically unrelated negative control (oral hypoglycemic agents; code 396) assessed false-positive rates under the same analytic design.</w:t>
+        <w:t xml:space="preserve">Methods: </w:t>
       </w:r>
       <w:r>
         <w:rPr>
           <w:bCs/>
         </w:rPr>
+        <w:t>We conducted a cross-sectional ecological study across Japan’s 47 prefectures (National Database of Health Insurance Claims and Specific Health Checkups [NDB] Open Data, fiscal year 2023), using seasonal pollen dispersal as a natural experiment. An allergy-specific outcome (antihistamines, ophthalmic, and nasal preparations; codes 441/449/131/132) and a pharmacologically heterogeneous comparator (topical anti-inflammatory agents; code 264) were evaluated under identical exposure variables, covariates, and regression frameworks. A pharmacologically unrelated negative control (oral hypoglycemic agents; code 396) assessed false-positive rates under the same analytic design.</w:t>
       </w:r>
     </w:p>
     <w:p>
@@ -246,17 +247,20 @@
         <w:rPr>
           <w:b/>
         </w:rPr>
-        <w:t>Conclusions: These findings suggest that medication-based outcomes may function as measurement instruments rather than interchangeable proxies for disease. When diagnosis-linked data are unavailable, testing outcome specificity before interpreting ecological associations may improve the reliability of findings. Pairing a disease-aligned outcome with a heterogeneous comparator is a feasible strategy to identify outcome misclassification in open claims databases.</w:t>
+        <w:t xml:space="preserve">Conclusions: </w:t>
       </w:r>
       <w:r>
         <w:rPr>
           <w:bCs/>
         </w:rPr>
+        <w:t xml:space="preserve">These findings suggest that medication-based outcomes may function as measurement instruments rather than interchangeable proxies for disease. When diagnosis-linked data are unavailable, testing outcome specificity before interpreting ecological associations may improve the </w:t>
       </w:r>
       <w:r>
         <w:rPr>
           <w:bCs/>
         </w:rPr>
+        <w:lastRenderedPageBreak/>
+        <w:t>reliability of findings. Pairing a disease-aligned outcome with a heterogeneous comparator is a feasible strategy to identify outcome misclassification in open claims databases.</w:t>
       </w:r>
     </w:p>
     <w:p>
@@ -1028,12 +1032,12 @@
     </w:p>
     <w:p>
       <w:r>
-        <w:lastRenderedPageBreak/>
         <w:t>Lash TL, Fox MP, Fink AK (2009) Applying Quantitative Bias Analysis to Epidemiologic Data. Springer, New York</w:t>
       </w:r>
     </w:p>
     <w:p>
       <w:r>
+        <w:lastRenderedPageBreak/>
         <w:t>Ministry of Health, Labour and Welfare (2023) NDB Open Data (10th edition). https://www.mhlw.go.jp/stf/seisakunitsuite/bunya/0000177182.html. Accessed 18 June 2026</w:t>
       </w:r>
     </w:p>
@@ -1136,6 +1140,7 @@
     </w:p>
     <w:p>
       <w:r>
+        <w:lastRenderedPageBreak/>
         <w:t>This study used only publicly available aggregate data from the NDB Open Data (National Database of Health Insurance Claims and Specific Health Checkups of Japan) published by the Ministry of Health, Labour and Welfare of Japan. The NDB Open Data consist entirely of pre-anonymised aggregate statistics; no individual patient records or identifiable data were accessed. In accordance with the Ethical Guidelines for Medical and Health Research Involving Human Subjects (Japan), ethical review board approval was not required for this analysis of publicly available aggregate data.</w:t>
       </w:r>
     </w:p>
@@ -1170,7 +1175,6 @@
         <w:rPr>
           <w:b/>
         </w:rPr>
-        <w:lastRenderedPageBreak/>
         <w:t>Data Availability</w:t>
       </w:r>
     </w:p>
@@ -1223,6 +1227,7 @@
         <w:pStyle w:val="1"/>
       </w:pPr>
       <w:r>
+        <w:lastRenderedPageBreak/>
         <w:t>Supplementary Table S1. Source-backed comparator outcome analysis (code 264)</w:t>
       </w:r>
     </w:p>
@@ -1264,7 +1269,6 @@
                 <w:b/>
                 <w:sz w:val="17"/>
               </w:rPr>
-              <w:lastRenderedPageBreak/>
               <w:t>Metric</w:t>
             </w:r>
           </w:p>
@@ -3184,6 +3188,7 @@
                 <w:color w:val="000000"/>
                 <w:sz w:val="17"/>
               </w:rPr>
+              <w:lastRenderedPageBreak/>
               <w:t>M9 (Temperature)</w:t>
             </w:r>
           </w:p>
@@ -3619,7 +3624,6 @@
         <w:pStyle w:val="1"/>
       </w:pPr>
       <w:r>
-        <w:lastRenderedPageBreak/>
         <w:t>Supplementary Source Tables</w:t>
       </w:r>
     </w:p>
@@ -5766,6 +5770,7 @@
                 <w:rFonts w:asciiTheme="majorHAnsi" w:hAnsiTheme="majorHAnsi" w:cstheme="majorHAnsi"/>
                 <w:sz w:val="17"/>
               </w:rPr>
+              <w:lastRenderedPageBreak/>
               <w:t>3</w:t>
             </w:r>
           </w:p>
@@ -6413,7 +6418,6 @@
         <w:pStyle w:val="1"/>
       </w:pPr>
       <w:r>
-        <w:lastRenderedPageBreak/>
         <w:t>Supplementary Table S6. Coefficients for the best-fitting model (Model 6: SPM specification with interaction)</w:t>
       </w:r>
     </w:p>
@@ -8901,6 +8905,7 @@
                 <w:rFonts w:asciiTheme="majorHAnsi" w:hAnsiTheme="majorHAnsi" w:cstheme="majorHAnsi"/>
                 <w:sz w:val="17"/>
               </w:rPr>
+              <w:lastRenderedPageBreak/>
               <w:t>No interaction term</w:t>
             </w:r>
           </w:p>
@@ -9207,7 +9212,6 @@
         <w:pStyle w:val="1"/>
       </w:pPr>
       <w:r>
-        <w:lastRenderedPageBreak/>
         <w:t>Supplementary Table S9. Sensitivity analysis for Model 5 (PM2.5 specification).</w:t>
       </w:r>
     </w:p>
@@ -11160,6 +11164,7 @@
         <w:pStyle w:val="1"/>
       </w:pPr>
       <w:r>
+        <w:lastRenderedPageBreak/>
         <w:t>Supplementary Table S12. Negative control analysis: diabetes medications (code 396)</w:t>
       </w:r>
     </w:p>
@@ -11173,11 +11178,7 @@
       </w:r>
       <w:proofErr w:type="gramEnd"/>
       <w:r>
-        <w:t xml:space="preserve"> p = 0.075). Only 1 of 6 sensitivity specifications reached p &lt; 0.05, confirming that the allergy-specific pollen signal does not reflect generic ecological confounding. High R² values for the </w:t>
-      </w:r>
-      <w:r>
-        <w:lastRenderedPageBreak/>
-        <w:t>diabetes outcome (0.58–0.60) were attributable to aging rate (p &lt; 0.001) and particulate matter, not pollen.</w:t>
+        <w:t xml:space="preserve"> p = 0.075). Only 1 of 6 sensitivity specifications reached p &lt; 0.05, confirming that the allergy-specific pollen signal does not reflect generic ecological confounding. High R² values for the diabetes outcome (0.58–0.60) were attributable to aging rate (p &lt; 0.001) and particulate matter, not pollen.</w:t>
       </w:r>
     </w:p>
     <w:tbl>

</xml_diff>